<commit_message>
feat: implemented financial rows in quote generator
</commit_message>
<xml_diff>
--- a/generated_quotes/Tempo_Qoute_EZ_1853_Anaya Sales.docx
+++ b/generated_quotes/Tempo_Qoute_EZ_1853_Anaya Sales.docx
@@ -693,7 +693,7 @@
         </w:rPr>
         <w:t>Ref. No. : Tempo/Quote/EZ/1853</w:t>
         <w:tab/>
-        <w:t xml:space="preserve">                                                          Date:01/09/2026 </w:t>
+        <w:t xml:space="preserve">                                                          Date:02/09/2026 </w:t>
       </w:r>
       <w:proofErr w:type="gramStart"/>
       <w:r>
@@ -851,7 +851,7 @@
         <w:rPr>
           <w:rFonts w:ascii="Aptos" w:hAnsi="Aptos" w:cs="Aptos" w:eastAsia="Aptos"/>
         </w:rPr>
-        <w:t>Bhubaneswar ,Odisha</w:t>
+        <w:t>Bhubaneshwar</w:t>
       </w:r>
     </w:p>
     <w:p>
@@ -863,7 +863,7 @@
         <w:rPr>
           <w:rFonts w:ascii="Aptos" w:hAnsi="Aptos" w:cs="Aptos" w:eastAsia="Aptos"/>
         </w:rPr>
-        <w:t>Bhubaneswar - 401107</w:t>
+        <w:t>Odisha - 401107</w:t>
       </w:r>
       <w:proofErr w:type="spellStart"/>
       <w:r/>
@@ -978,7 +978,7 @@
         <w:rPr>
           <w:rFonts w:ascii="Aptos" w:hAnsi="Aptos" w:cs="Aptos" w:eastAsia="Aptos"/>
         </w:rPr>
-        <w:t>Your Ref.: Your Whatsapp enquiry Dt. 01/09/2026</w:t>
+        <w:t>Your Ref.: Your Whatsapp enquiry Dt. 02/09/2026</w:t>
       </w:r>
       <w:r>
         <w:rPr>
@@ -5034,6 +5034,171 @@
                 <w:bCs/>
               </w:rPr>
               <w:t>5,500</w:t>
+            </w:r>
+          </w:p>
+        </w:tc>
+      </w:tr>
+      <w:tr>
+        <w:tc>
+          <w:tcPr>
+            <w:tcW w:type="dxa" w:w="8515"/>
+            <w:gridSpan w:val="7"/>
+            <w:vAlign w:val="center"/>
+          </w:tcPr>
+          <w:p>
+            <w:r>
+              <w:rPr>
+                <w:rFonts w:ascii="Aptos" w:hAnsi="Aptos"/>
+                <w:b w:val="0"/>
+              </w:rPr>
+              <w:t>(+) Add : Packing Charges</w:t>
+            </w:r>
+          </w:p>
+        </w:tc>
+        <w:tc>
+          <w:tcPr>
+            <w:tcW w:type="dxa" w:w="993"/>
+            <w:vAlign w:val="center"/>
+          </w:tcPr>
+          <w:p>
+            <w:r>
+              <w:rPr>
+                <w:rFonts w:ascii="Aptos" w:hAnsi="Aptos"/>
+                <w:b w:val="0"/>
+              </w:rPr>
+              <w:t>→ INCLUSIVE</w:t>
+            </w:r>
+          </w:p>
+        </w:tc>
+      </w:tr>
+      <w:tr>
+        <w:tc>
+          <w:tcPr>
+            <w:tcW w:type="dxa" w:w="8515"/>
+            <w:gridSpan w:val="7"/>
+            <w:vAlign w:val="center"/>
+          </w:tcPr>
+          <w:p>
+            <w:r>
+              <w:rPr>
+                <w:rFonts w:ascii="Aptos" w:hAnsi="Aptos"/>
+                <w:b w:val="0"/>
+              </w:rPr>
+              <w:t>(+) Add : Freight Charges</w:t>
+            </w:r>
+          </w:p>
+        </w:tc>
+        <w:tc>
+          <w:tcPr>
+            <w:tcW w:type="dxa" w:w="993"/>
+            <w:vAlign w:val="center"/>
+          </w:tcPr>
+          <w:p>
+            <w:r>
+              <w:rPr>
+                <w:rFonts w:ascii="Aptos" w:hAnsi="Aptos"/>
+                <w:b w:val="0"/>
+              </w:rPr>
+              <w:t>→ INCLUSIVE</w:t>
+            </w:r>
+          </w:p>
+        </w:tc>
+      </w:tr>
+      <w:tr>
+        <w:tc>
+          <w:tcPr>
+            <w:tcW w:type="dxa" w:w="8515"/>
+            <w:gridSpan w:val="7"/>
+            <w:vAlign w:val="center"/>
+          </w:tcPr>
+          <w:p>
+            <w:r>
+              <w:rPr>
+                <w:rFonts w:ascii="Aptos" w:hAnsi="Aptos"/>
+                <w:b/>
+              </w:rPr>
+              <w:t>Gross Total</w:t>
+            </w:r>
+          </w:p>
+        </w:tc>
+        <w:tc>
+          <w:tcPr>
+            <w:tcW w:type="dxa" w:w="993"/>
+            <w:vAlign w:val="center"/>
+          </w:tcPr>
+          <w:p>
+            <w:r>
+              <w:rPr>
+                <w:rFonts w:ascii="Aptos" w:hAnsi="Aptos"/>
+                <w:b/>
+              </w:rPr>
+              <w:t>→ ₹ 2,59,950</w:t>
+            </w:r>
+          </w:p>
+        </w:tc>
+      </w:tr>
+      <w:tr>
+        <w:tc>
+          <w:tcPr>
+            <w:tcW w:type="dxa" w:w="8515"/>
+            <w:gridSpan w:val="7"/>
+            <w:vAlign w:val="center"/>
+          </w:tcPr>
+          <w:p>
+            <w:r>
+              <w:rPr>
+                <w:rFonts w:ascii="Aptos" w:hAnsi="Aptos"/>
+                <w:b w:val="0"/>
+              </w:rPr>
+              <w:t>(+) Add : GST 18%</w:t>
+            </w:r>
+          </w:p>
+        </w:tc>
+        <w:tc>
+          <w:tcPr>
+            <w:tcW w:type="dxa" w:w="993"/>
+            <w:vAlign w:val="center"/>
+          </w:tcPr>
+          <w:p>
+            <w:r>
+              <w:rPr>
+                <w:rFonts w:ascii="Aptos" w:hAnsi="Aptos"/>
+                <w:b w:val="0"/>
+              </w:rPr>
+              <w:t>→ ₹ 46,791</w:t>
+            </w:r>
+          </w:p>
+        </w:tc>
+      </w:tr>
+      <w:tr>
+        <w:tc>
+          <w:tcPr>
+            <w:tcW w:type="dxa" w:w="8515"/>
+            <w:gridSpan w:val="7"/>
+            <w:vAlign w:val="center"/>
+          </w:tcPr>
+          <w:p>
+            <w:r>
+              <w:rPr>
+                <w:rFonts w:ascii="Aptos" w:hAnsi="Aptos"/>
+                <w:b/>
+              </w:rPr>
+              <w:t>Gross Total Amount</w:t>
+            </w:r>
+          </w:p>
+        </w:tc>
+        <w:tc>
+          <w:tcPr>
+            <w:tcW w:type="dxa" w:w="993"/>
+            <w:vAlign w:val="center"/>
+          </w:tcPr>
+          <w:p>
+            <w:r>
+              <w:rPr>
+                <w:rFonts w:ascii="Aptos" w:hAnsi="Aptos"/>
+                <w:b/>
+              </w:rPr>
+              <w:t>→ ₹ 3,06,741</w:t>
             </w:r>
           </w:p>
         </w:tc>

</xml_diff>